<commit_message>
homework template and G02.4
</commit_message>
<xml_diff>
--- a/homework-template.docx
+++ b/homework-template.docx
@@ -33,15 +33,7 @@
       </w:pPr>
       <w:r>
         <w:rPr/>
-        <w:t>Homework</w:t>
-      </w:r>
-      <w:r>
-        <w:rPr/>
-        <w:t xml:space="preserve"> Assignment </w:t>
-      </w:r>
-      <w:r>
-        <w:rPr/>
-        <w:t>no. ______</w:t>
+        <w:t>Homework Assignment no. ______</w:t>
       </w:r>
     </w:p>
     <w:p>
@@ -184,23 +176,7 @@
       </w:pPr>
       <w:r>
         <w:rPr/>
-        <w:t>T</w:t>
-      </w:r>
-      <w:r>
-        <w:rPr/>
-        <w:t xml:space="preserve">ake a screenshot of your VSCode window </w:t>
-      </w:r>
-      <w:r>
-        <w:rPr/>
-        <w:t xml:space="preserve">clearly </w:t>
-      </w:r>
-      <w:r>
-        <w:rPr/>
-        <w:t xml:space="preserve">showing the prompt you gave to the agent and the response it gave you back. </w:t>
-      </w:r>
-      <w:r>
-        <w:rPr/>
-        <w:t>Your FAU ID must be visible on the screenshot.</w:t>
+        <w:t>Take a screenshot of your VSCode window clearly showing the prompt you gave to the agent and the response it gave you back. Your FAU ID must be visible on the screenshot.</w:t>
       </w:r>
     </w:p>
     <w:p>
@@ -216,23 +192,7 @@
       </w:pPr>
       <w:r>
         <w:rPr/>
-        <w:t>T</w:t>
-      </w:r>
-      <w:r>
-        <w:rPr/>
-        <w:t xml:space="preserve">ake a screenshot of your VSCode window </w:t>
-      </w:r>
-      <w:r>
-        <w:rPr/>
-        <w:t xml:space="preserve">clearly </w:t>
-      </w:r>
-      <w:r>
-        <w:rPr/>
-        <w:t xml:space="preserve">showing at least the top few lines of code that were generated or modified by the agent. </w:t>
-      </w:r>
-      <w:r>
-        <w:rPr/>
-        <w:t>Your FAU ID must be visible on the screenshot.</w:t>
+        <w:t>Take a screenshot of your VSCode window clearly showing at least the top few lines of code that were generated or modified by the agent. Your FAU ID must be visible on the screenshot.</w:t>
       </w:r>
     </w:p>
     <w:p>
@@ -248,39 +208,7 @@
       </w:pPr>
       <w:r>
         <w:rPr/>
-        <w:t>Insert th</w:t>
-      </w:r>
-      <w:r>
-        <w:rPr/>
-        <w:t>e</w:t>
-      </w:r>
-      <w:r>
-        <w:rPr/>
-        <w:t xml:space="preserve"> screenshot</w:t>
-      </w:r>
-      <w:r>
-        <w:rPr/>
-        <w:t>s</w:t>
-      </w:r>
-      <w:r>
-        <w:rPr/>
-        <w:t xml:space="preserve"> into the homework Word document, along with </w:t>
-      </w:r>
-      <w:r>
-        <w:rPr/>
-        <w:t xml:space="preserve">the </w:t>
-      </w:r>
-      <w:r>
-        <w:rPr/>
-        <w:t xml:space="preserve">task prompt given to the agent </w:t>
-      </w:r>
-      <w:r>
-        <w:rPr/>
-        <w:t>pasted as regular text</w:t>
-      </w:r>
-      <w:r>
-        <w:rPr/>
-        <w:t>.</w:t>
+        <w:t>Insert the screenshots into the homework Word document, along with the task prompt given to the agent pasted as regular text.</w:t>
       </w:r>
     </w:p>
     <w:p>
@@ -296,23 +224,7 @@
       </w:pPr>
       <w:r>
         <w:rPr/>
-        <w:t>When finished, convert the Word document to PD</w:t>
-      </w:r>
-      <w:r>
-        <w:rPr/>
-        <w:t>F</w:t>
-      </w:r>
-      <w:r>
-        <w:rPr/>
-        <w:t xml:space="preserve"> and upload on the </w:t>
-      </w:r>
-      <w:r>
-        <w:rPr/>
-        <w:t>h</w:t>
-      </w:r>
-      <w:r>
-        <w:rPr/>
-        <w:t>omework Canvas page.</w:t>
+        <w:t>When finished, convert the Word document to PDF and upload on the homework Canvas page.</w:t>
       </w:r>
     </w:p>
     <w:p>
@@ -387,7 +299,19 @@
         </w:rPr>
       </w:pPr>
       <w:r>
-        <w:rPr/>
+        <w:rPr>
+          <w:rFonts w:eastAsia="Noto Sans CJK SC" w:cs="Noto Sans Devanagari" w:ascii="Liberation Sans" w:hAnsi="Liberation Sans"/>
+          <w:b w:val="false"/>
+          <w:bCs w:val="false"/>
+          <w:i/>
+          <w:iCs/>
+          <w:color w:val="000000"/>
+          <w:kern w:val="2"/>
+          <w:sz w:val="24"/>
+          <w:szCs w:val="24"/>
+          <w:shd w:fill="auto" w:val="clear"/>
+          <w:lang w:val="en-US" w:eastAsia="zh-CN" w:bidi="hi-IN"/>
+        </w:rPr>
       </w:r>
     </w:p>
     <w:p>
@@ -451,7 +375,19 @@
         </w:rPr>
       </w:pPr>
       <w:r>
-        <w:rPr/>
+        <w:rPr>
+          <w:rFonts w:eastAsia="Noto Sans CJK SC" w:cs="Noto Sans Devanagari" w:ascii="Liberation Sans" w:hAnsi="Liberation Sans"/>
+          <w:b w:val="false"/>
+          <w:bCs w:val="false"/>
+          <w:i/>
+          <w:iCs/>
+          <w:color w:val="000000"/>
+          <w:kern w:val="2"/>
+          <w:sz w:val="24"/>
+          <w:szCs w:val="24"/>
+          <w:shd w:fill="auto" w:val="clear"/>
+          <w:lang w:val="en-US" w:eastAsia="zh-CN" w:bidi="hi-IN"/>
+        </w:rPr>
       </w:r>
     </w:p>
     <w:p>
@@ -468,11 +404,7 @@
       </w:pPr>
       <w:r>
         <w:rPr/>
-        <w:t>Application name</w:t>
-      </w:r>
-      <w:r>
-        <w:rPr/>
-        <w:t xml:space="preserve">: </w:t>
+        <w:t xml:space="preserve">Application name: </w:t>
       </w:r>
       <w:r>
         <w:rPr>
@@ -484,19 +416,7 @@
           <w:szCs w:val="24"/>
           <w:shd w:fill="auto" w:val="clear"/>
         </w:rPr>
-        <w:t xml:space="preserve">&lt;enter here </w:t>
-      </w:r>
-      <w:r>
-        <w:rPr>
-          <w:b w:val="false"/>
-          <w:bCs w:val="false"/>
-          <w:i/>
-          <w:iCs/>
-          <w:sz w:val="24"/>
-          <w:szCs w:val="24"/>
-          <w:shd w:fill="auto" w:val="clear"/>
-        </w:rPr>
-        <w:t>your application name</w:t>
+        <w:t>&lt;enter here your application name</w:t>
       </w:r>
       <w:r>
         <w:rPr>
@@ -535,7 +455,12 @@
         </w:rPr>
       </w:pPr>
       <w:r>
-        <w:rPr/>
+        <w:rPr>
+          <w:b w:val="false"/>
+          <w:bCs w:val="false"/>
+          <w:i/>
+          <w:iCs/>
+        </w:rPr>
       </w:r>
     </w:p>
     <w:p>
@@ -582,7 +507,12 @@
         </w:rPr>
       </w:pPr>
       <w:r>
-        <w:rPr/>
+        <w:rPr>
+          <w:b w:val="false"/>
+          <w:bCs w:val="false"/>
+          <w:i/>
+          <w:iCs/>
+        </w:rPr>
       </w:r>
     </w:p>
     <w:p>
@@ -599,7 +529,12 @@
         </w:rPr>
       </w:pPr>
       <w:r>
-        <w:rPr/>
+        <w:rPr>
+          <w:b w:val="false"/>
+          <w:bCs w:val="false"/>
+          <w:i/>
+          <w:iCs/>
+        </w:rPr>
       </w:r>
     </w:p>
     <w:p>
@@ -617,25 +552,7 @@
           <w:i/>
           <w:iCs/>
         </w:rPr>
-        <w:t>R</w:t>
-      </w:r>
-      <w:r>
-        <w:rPr>
-          <w:b w:val="false"/>
-          <w:bCs w:val="false"/>
-          <w:i/>
-          <w:iCs/>
-        </w:rPr>
-        <w:t xml:space="preserve">epeat </w:t>
-      </w:r>
-      <w:r>
-        <w:rPr>
-          <w:b w:val="false"/>
-          <w:bCs w:val="false"/>
-          <w:i/>
-          <w:iCs/>
-        </w:rPr>
-        <w:t>for each step:</w:t>
+        <w:t>Repeat for each step:</w:t>
       </w:r>
     </w:p>
     <w:p>
@@ -662,25 +579,7 @@
           <w:i/>
           <w:iCs/>
         </w:rPr>
-        <w:t xml:space="preserve">paste here the screenshots </w:t>
-      </w:r>
-      <w:r>
-        <w:rPr>
-          <w:b w:val="false"/>
-          <w:bCs w:val="false"/>
-          <w:i/>
-          <w:iCs/>
-        </w:rPr>
-        <w:t xml:space="preserve">and task prompts </w:t>
-      </w:r>
-      <w:r>
-        <w:rPr>
-          <w:b w:val="false"/>
-          <w:bCs w:val="false"/>
-          <w:i/>
-          <w:iCs/>
-        </w:rPr>
-        <w:t>...</w:t>
+        <w:t>paste here the screenshots and task prompts ...</w:t>
       </w:r>
     </w:p>
     <w:sectPr>
@@ -923,6 +822,7 @@
         </w:tabs>
         <w:ind w:start="720" w:hanging="360"/>
       </w:pPr>
+      <w:rPr/>
     </w:lvl>
     <w:lvl w:ilvl="1">
       <w:start w:val="1"/>
@@ -935,6 +835,7 @@
         </w:tabs>
         <w:ind w:start="1080" w:hanging="360"/>
       </w:pPr>
+      <w:rPr/>
     </w:lvl>
     <w:lvl w:ilvl="2">
       <w:start w:val="1"/>
@@ -947,6 +848,7 @@
         </w:tabs>
         <w:ind w:start="1440" w:hanging="360"/>
       </w:pPr>
+      <w:rPr/>
     </w:lvl>
     <w:lvl w:ilvl="3">
       <w:start w:val="1"/>
@@ -959,6 +861,7 @@
         </w:tabs>
         <w:ind w:start="1800" w:hanging="360"/>
       </w:pPr>
+      <w:rPr/>
     </w:lvl>
     <w:lvl w:ilvl="4">
       <w:start w:val="1"/>
@@ -971,6 +874,7 @@
         </w:tabs>
         <w:ind w:start="2160" w:hanging="360"/>
       </w:pPr>
+      <w:rPr/>
     </w:lvl>
     <w:lvl w:ilvl="5">
       <w:start w:val="1"/>

</xml_diff>